<commit_message>
feat: enforce profile permissions and publish management updates
</commit_message>
<xml_diff>
--- a/docs/Proposta-de-tabelas-Ecossistema-de-Inovacao.docx
+++ b/docs/Proposta-de-tabelas-Ecossistema-de-Inovacao.docx
@@ -7,7 +7,7 @@
         <w:pStyle w:val="Title"/>
       </w:pPr>
       <w:r>
-        <w:t xml:space="preserve">Ecossistema de Inovação</w:t>
+        <w:t xml:space="preserve">Inovacaoguarapuava</w:t>
       </w:r>
     </w:p>
     <w:p>
@@ -238,7 +238,7 @@
     </w:p>
     <w:p>
       <w:r>
-        <w:t xml:space="preserve">Cadastro central das instituições do ecossistema.</w:t>
+        <w:t xml:space="preserve">Cadastro central das instituições do Inovacaoguarapuava.</w:t>
       </w:r>
     </w:p>
     <w:tbl>

</xml_diff>